<commit_message>
B3: remove redundant Index Terms line
The "Index Terms:" line (IEEE convention) was removed from the title
block. Keywords line (Elsevier convention, 8 terms) remains as the
authoritative keyword surface for B:R&A submission.

Word count delta: -12 (13,700 -> 13,688)

Co-Authored-By: Claude Opus 4.7 (1M context) <noreply@anthropic.com>
</commit_message>
<xml_diff>
--- a/b3/paper/B3_GeoDePIN_Final_v10.docx
+++ b/b3/paper/B3_GeoDePIN_Final_v10.docx
@@ -81,21 +81,6 @@
       </w:r>
       <w:r>
         <w:t>D43, D47, L14, L22, O33, R12</w:t>
-      </w:r>
-    </w:p>
-    <w:p>
-      <w:pPr>
-        <w:pStyle w:val="Heading2"/>
-        <w:spacing w:before="240"/>
-      </w:pPr>
-      <w:r>
-        <w:rPr>
-          <w:b/>
-        </w:rPr>
-        <w:t>Index Terms: DePIN, token economics, mechanism design, infrastructure governance, Helium, Subsidy-to-Revenue ratio</w:t>
-      </w:r>
-      <w:r>
-        <w:rPr/>
       </w:r>
     </w:p>
     <w:p>

</xml_diff>